<commit_message>
UST-06 resellada VALIDADA Y FIRMADA (Juanjo 24-ago 21:29, decisiones F1-G1 + comentario producto)
</commit_message>
<xml_diff>
--- a/_integration/docs/ust/UST-2026-08-24-06-wearables-o1-o3.docx
+++ b/_integration/docs/ust/UST-2026-08-24-06-wearables-o1-o3.docx
@@ -40,12 +40,12 @@
         <w:rPr>
           <w:b/>
           <w:bCs/>
-          <w:color w:val="3D1E25"/>
+          <w:color w:val="FF5D00"/>
           <w:sz w:val="21"/>
           <w:szCs w:val="21"/>
           <w:rFonts w:ascii="Calibri" w:cs="Calibri" w:eastAsia="Calibri" w:hAnsi="Calibri"/>
         </w:rPr>
-        <w:t xml:space="preserve">ESTADO: PENDIENTE DE VALIDACIÓN (solo Juanjo bloquea) — founders validan borradores en paralelo, sin bloquear (decisión 24-ago). Audidat/EIPD aparcado a pre-GA: test interno.</w:t>
+        <w:t xml:space="preserve">ESTADO: VALIDADA Y FIRMADA — Juanjo, 24-08-2026 21:29 (hora Madrid), sesión interactiva pregunta a pregunta. Comentario de la firma: Pilar y Lucía validarán el PRODUCTO (pantallas, textos, paseo DoD). Audidat/EIPD aparcado a pre-GA: test interno.</w:t>
       </w:r>
     </w:p>
     <w:p>
@@ -239,7 +239,7 @@
                 <w:szCs w:val="19"/>
                 <w:rFonts w:ascii="Calibri" w:cs="Calibri" w:eastAsia="Calibri" w:hAnsi="Calibri"/>
               </w:rPr>
-              <w:t xml:space="preserve">Preguntas / decisiones a validar</w:t>
+              <w:t xml:space="preserve">Decisión validada (firma 24-ago)</w:t>
             </w:r>
           </w:p>
         </w:tc>
@@ -337,7 +337,7 @@
                 <w:szCs w:val="19"/>
                 <w:rFonts w:ascii="Calibri" w:cs="Calibri" w:eastAsia="Calibri" w:hAnsi="Calibri"/>
               </w:rPr>
-              <w:t xml:space="preserve">¿Confirmas las 3 esenciales + 5 opcionales tal cual el §4? DoD: en dispositivo físico con datos reales de Salud; denegar TODOS los permisos → la app funciona idéntica (riesgo nº1 del §9).</w:t>
+              <w:t xml:space="preserve">VALIDADA: sí, tal cual §4 — 3 esenciales + 5 opcionales. DoD: en dispositivo físico con datos reales de Salud; denegar TODOS los permisos → la app funciona idéntica (riesgo nº1 del §9).</w:t>
             </w:r>
           </w:p>
         </w:tc>
@@ -435,7 +435,7 @@
                 <w:szCs w:val="19"/>
                 <w:rFonts w:ascii="Calibri" w:cs="Calibri" w:eastAsia="Calibri" w:hAnsi="Calibri"/>
               </w:rPr>
-              <w:t xml:space="preserve">¿El write-back se ofrece en el mismo diálogo de conexión (propuesta: sí, como toggle separado) o como opción posterior en Ajustes?</w:t>
+              <w:t xml:space="preserve">VALIDADA: toggle SEPARADO en el mismo diálogo de conexión, apagado por defecto — un solo momento de decisión, lectura y escritura explicadas por separado.</w:t>
             </w:r>
           </w:p>
         </w:tc>
@@ -533,7 +533,7 @@
                 <w:szCs w:val="19"/>
                 <w:rFonts w:ascii="Calibri" w:cs="Calibri" w:eastAsia="Calibri" w:hAnsi="Calibri"/>
               </w:rPr>
-              <w:t xml:space="preserve">Health Connect exige declaración de permisos de salud en Play Console (ya declaramos salud en el alta) — verificar si pide formulario adicional ANTES del build para no bloquear la subida.</w:t>
+              <w:t xml:space="preserve">ANOTADA (sin decisión de producto): la verificación del formulario de salud de Play Console la hace el ASISTENTE antes del build — no bloquea la firma.</w:t>
             </w:r>
           </w:p>
         </w:tc>
@@ -631,7 +631,7 @@
                 <w:szCs w:val="19"/>
                 <w:rFonts w:ascii="Calibri" w:cs="Calibri" w:eastAsia="Calibri" w:hAnsi="Calibri"/>
               </w:rPr>
-              <w:t xml:space="preserve">El asistente entrega el BORRADOR del texto de consentimiento (partiendo del §4/§7 y de los legales del piloto); Pilar lo valida en paralelo SIN bloquear (decisión 24-ago). ¿El consent aparece en la primera visita al registro diario (propuesta) o solo desde Ajustes?</w:t>
+              <w:t xml:space="preserve">VALIDADA: el consent aparece en la PRIMERA visita al registro diario (invitación no bloqueante) y siempre disponible en Ajustes. El asistente entrega el BORRADOR del texto (partiendo del §4/§7 y los legales del piloto); Pilar valida el texto como parte de la validación de PRODUCTO (comentario de la firma).</w:t>
             </w:r>
           </w:p>
         </w:tc>
@@ -729,7 +729,7 @@
                 <w:szCs w:val="19"/>
                 <w:rFonts w:ascii="Calibri" w:cs="Calibri" w:eastAsia="Calibri" w:hAnsi="Calibri"/>
               </w:rPr>
-              <w:t xml:space="preserve">Ninguna decisión nueva: es aplicar lo firmado. Los tests del contrato (21) se amplían con casos de procedencia y de conflicto ella-vs-reloj.</w:t>
+              <w:t xml:space="preserve">VALIDADA: sin decisión nueva — aplicar lo firmado. Los tests del contrato (21) se amplían con casos de procedencia y de conflicto ella-vs-reloj.</w:t>
             </w:r>
           </w:p>
         </w:tc>
@@ -827,7 +827,7 @@
                 <w:szCs w:val="19"/>
                 <w:rFonts w:ascii="Calibri" w:cs="Calibri" w:eastAsia="Calibri" w:hAnsi="Calibri"/>
               </w:rPr>
-              <w:t xml:space="preserve">¿Va también en la 0.23.0 el resto de su carga nativa ya fichada (timeouts por superficie, cámara custom, D20 Crashlytics si se firma)? Propuesta: timeouts sí (pequeño y decidido); el resto solo si no arrastra el build.</w:t>
+              <w:t xml:space="preserve">VALIDADA — la 0.23.0 embarca ADEMÁS: timeouts por superficie (re-lock 5 min app · logout 30 min hub) · cámara custom (expo-camera, pantalla propia del escaneo) · Crashlytics SOLO si D20 se firma antes del freeze (lun 1-sep; si no, cae sin bloquear) · librerías de actividad expo-sensors + expo-location — SOLO las librerías: permiso «mientras se usa», CERO modos background/Always hasta validar la propuesta de actividad (O7); sus pantallas llegarán por OTA.</w:t>
             </w:r>
           </w:p>
         </w:tc>
@@ -956,6 +956,139 @@
           <w:rFonts w:ascii="Calibri" w:cs="Calibri" w:eastAsia="Calibri" w:hAnsi="Calibri"/>
         </w:rPr>
         <w:t xml:space="preserve">Revisión EIPD/Audidat de wearables — APARCADA a pre-GA por decisión de Juanjo (24-ago): test interno bajo el consentimiento del piloto. Queda en la lista de deudas pre-GA.</w:t>
+      </w:r>
+    </w:p>
+    <w:p>
+      <w:pPr>
+        <w:pStyle w:val="Heading1"/>
+        <w:spacing w:before="200"/>
+      </w:pPr>
+      <w:r>
+        <w:rPr>
+          <w:b/>
+          <w:bCs/>
+          <w:color w:val="3D1E25"/>
+          <w:sz w:val="26"/>
+          <w:szCs w:val="26"/>
+          <w:rFonts w:ascii="Calibri" w:cs="Calibri" w:eastAsia="Calibri" w:hAnsi="Calibri"/>
+        </w:rPr>
+        <w:t xml:space="preserve">Validación y firma</w:t>
+      </w:r>
+    </w:p>
+    <w:p>
+      <w:pPr>
+        <w:spacing w:after="120"/>
+      </w:pPr>
+      <w:r>
+        <w:rPr>
+          <w:color w:val="3D1E25"/>
+          <w:sz w:val="21"/>
+          <w:szCs w:val="21"/>
+          <w:rFonts w:ascii="Calibri" w:cs="Calibri" w:eastAsia="Calibri" w:hAnsi="Calibri"/>
+        </w:rPr>
+        <w:t xml:space="preserve">Método: validación interactiva pregunta a pregunta (chat de ingeniería, 24-08-2026). Decisiones grabadas:</w:t>
+      </w:r>
+    </w:p>
+    <w:p>
+      <w:pPr>
+        <w:pStyle w:val="ListParagraph"/>
+        <w:numPr>
+          <w:ilvl w:val="0"/>
+          <w:numId w:val="2"/>
+        </w:numPr>
+      </w:pPr>
+      <w:r>
+        <w:rPr>
+          <w:color w:val="3D1E25"/>
+          <w:sz w:val="21"/>
+          <w:szCs w:val="21"/>
+          <w:rFonts w:ascii="Calibri" w:cs="Calibri" w:eastAsia="Calibri" w:hAnsi="Calibri"/>
+        </w:rPr>
+        <w:t xml:space="preserve">F1 · Señales: SÍ, tal cual §4 — 3 esenciales (sueño, entrenamientos, flujo) + 5 opcionales.</w:t>
+      </w:r>
+    </w:p>
+    <w:p>
+      <w:pPr>
+        <w:pStyle w:val="ListParagraph"/>
+        <w:numPr>
+          <w:ilvl w:val="0"/>
+          <w:numId w:val="2"/>
+        </w:numPr>
+      </w:pPr>
+      <w:r>
+        <w:rPr>
+          <w:color w:val="3D1E25"/>
+          <w:sz w:val="21"/>
+          <w:szCs w:val="21"/>
+          <w:rFonts w:ascii="Calibri" w:cs="Calibri" w:eastAsia="Calibri" w:hAnsi="Calibri"/>
+        </w:rPr>
+        <w:t xml:space="preserve">F2 · Write-back del período: toggle separado en el MISMO diálogo de conexión, apagado por defecto.</w:t>
+      </w:r>
+    </w:p>
+    <w:p>
+      <w:pPr>
+        <w:pStyle w:val="ListParagraph"/>
+        <w:numPr>
+          <w:ilvl w:val="0"/>
+          <w:numId w:val="2"/>
+        </w:numPr>
+      </w:pPr>
+      <w:r>
+        <w:rPr>
+          <w:color w:val="3D1E25"/>
+          <w:sz w:val="21"/>
+          <w:szCs w:val="21"/>
+          <w:rFonts w:ascii="Calibri" w:cs="Calibri" w:eastAsia="Calibri" w:hAnsi="Calibri"/>
+        </w:rPr>
+        <w:t xml:space="preserve">F4 · Consent: en la PRIMERA visita al registro diario (no bloqueante) + siempre en Ajustes.</w:t>
+      </w:r>
+    </w:p>
+    <w:p>
+      <w:pPr>
+        <w:pStyle w:val="ListParagraph"/>
+        <w:numPr>
+          <w:ilvl w:val="0"/>
+          <w:numId w:val="2"/>
+        </w:numPr>
+      </w:pPr>
+      <w:r>
+        <w:rPr>
+          <w:color w:val="3D1E25"/>
+          <w:sz w:val="21"/>
+          <w:szCs w:val="21"/>
+          <w:rFonts w:ascii="Calibri" w:cs="Calibri" w:eastAsia="Calibri" w:hAnsi="Calibri"/>
+        </w:rPr>
+        <w:t xml:space="preserve">G1 · Carga 0.23.0: wearables O1-O3 + timeouts + cámara custom + Crashlytics (condicionado a firma D20 antes del freeze) + expo-sensors y expo-location como librerías sin background (pantallas de actividad por OTA tras validar O7).</w:t>
+      </w:r>
+    </w:p>
+    <w:p>
+      <w:pPr>
+        <w:spacing w:after="120"/>
+      </w:pPr>
+      <w:r>
+        <w:rPr>
+          <w:color w:val="3D1E25"/>
+          <w:sz w:val="21"/>
+          <w:szCs w:val="21"/>
+          <w:rFonts w:ascii="Calibri" w:cs="Calibri" w:eastAsia="Calibri" w:hAnsi="Calibri"/>
+        </w:rPr>
+        <w:t xml:space="preserve">Comentario del validador: «Pilar y Lucía tendrán que validar el producto» — la firma abre el DESARROLLO; la validación de PRODUCTO (pantallas de Lucía, textos de consentimiento de Pilar, paseo DoD en dispositivo) queda expresamente en sus manos antes de dar la release por cerrada.</w:t>
+      </w:r>
+    </w:p>
+    <w:p>
+      <w:pPr>
+        <w:spacing w:after="120"/>
+      </w:pPr>
+      <w:r>
+        <w:rPr>
+          <w:b/>
+          <w:bCs/>
+          <w:color w:val="3D1E25"/>
+          <w:sz w:val="21"/>
+          <w:szCs w:val="21"/>
+          <w:rFonts w:ascii="Calibri" w:cs="Calibri" w:eastAsia="Calibri" w:hAnsi="Calibri"/>
+        </w:rPr>
+        <w:t xml:space="preserve">Firmado: Juanjo (Juan José Cebrián) · 24-08-2026 · 21:29 hora Madrid · UST-2026-08-24-06 → VALIDADA. Gate de compilación abierto.</w:t>
       </w:r>
     </w:p>
     <w:p>

</xml_diff>